<commit_message>
Add Response section addressing Caren's qualitative-analysis request
Updates update_eval_list.py to append a "Response: Qualitative Routing
Examples" subsection after the "Failure / Bias Illustration" request in
NIc_NIPS_eval_list_updated.docx. Summarises the qualitative analysis
added to main.tex Sec 5.5 + Appendix (fig_qualitative_main.pdf and
fig_qualitative_appendix.pdf): mining methodology, 1,048/3,007 FV-RA
clips satisfy the "two-way fails / TriRoute corrects" filter at seed 44,
6 representative cases shown total (1 main + 5 appendix), matching the
"4-6 examples" ask.

Co-Authored-By: Claude Opus 4.7 (1M context) <noreply@anthropic.com>
</commit_message>
<xml_diff>
--- a/paper/NIc_NIPS_eval_list_updated.docx
+++ b/paper/NIc_NIPS_eval_list_updated.docx
@@ -11780,6 +11780,38 @@
         <w:rPr>
           <w:rtl w:val="0"/>
         </w:rPr>
+      </w:r>
+    </w:p>
+    <w:p>
+      <w:pPr>
+        <w:pStyle w:val="Heading3"/>
+      </w:pPr>
+      <w:r>
+        <w:rPr>
+          <w:b/>
+          <w:sz w:val="26"/>
+        </w:rPr>
+        <w:t>Response: Qualitative Routing Examples (added in Section 5.5 + Appendix)</w:t>
+      </w:r>
+    </w:p>
+    <w:p>
+      <w:r>
+        <w:t>We mine FAVC FV-RA test clips on which the two-way baseline assigns P(fake) &lt; 0.5 (confidently misclassifies as real) while TriRoute assigns P(fake) &gt; 0.5, ranked by score gap. Of 3,007 FV-RA fake clips in the canonical FAVC test split, 1,048 (~35%) satisfy this “two-way fails / TriRoute corrects” filter at seed 44, with the largest gaps clustering around 0.99.</w:t>
+      </w:r>
+    </w:p>
+    <w:p>
+      <w:r>
+        <w:t>Figure fig_qualitative_main shows one representative case: three lip-region frames sampled across the clip (manipulated visual stream), the audio waveform (genuine RealAudio), and per-model fake probabilities. The two-way baseline assigns P(fake) ≈ 0.01 — fooled by the genuine audio — while TriRoute assigns P(fake) ≈ 1.00.</w:t>
+      </w:r>
+    </w:p>
+    <w:p>
+      <w:r>
+        <w:t>Figure fig_qualitative_appendix (in Appendix) reports the next-five highest-gap clips at seed 44, all from the same pool. The pattern is consistent across cases: audio waveform appears as ordinary speech, lip-region frames carry the manipulation, two-way assigns P(fake) ≈ 0.01 in every case, TriRoute assigns P(fake) ≥ 0.99.</w:t>
+      </w:r>
+    </w:p>
+    <w:p>
+      <w:r>
+        <w:t>Total: 6 cases (1 in main + 5 in appendix), matching Caren’s “4–6 examples” request.</w:t>
       </w:r>
     </w:p>
     <w:sectPr>

</xml_diff>